<commit_message>
docs: update progress report — Phase 4a design complete
Co-Authored-By: Claude Opus 4.7 <noreply@anthropic.com>
</commit_message>
<xml_diff>
--- a/Artifex_ProCal_Progress_Report.docx
+++ b/Artifex_ProCal_Progress_Report.docx
@@ -2697,6 +2697,17 @@
         <w:t>└── tauri.conf.json        # Tauri configuration</w:t>
       </w:r>
     </w:p>
+    <w:p>
+      <w:r>
+        <w:rPr>
+          <w:b/>
+        </w:rPr>
+        <w:t xml:space="preserve">Progress Update — 2026-04-26: </w:t>
+      </w:r>
+      <w:r>
+        <w:t>Phase 4a design spec completed and committed to docs/superpowers/specs/2026-04-25-phase4a-tauri-ipc-dashboard-design.md. Four sections approved: (1) Architecture &amp; IPC Layer with CalibrationService singleton, (2) Dashboard Shell Component Structure with collapsible sidebar, (3) Tauri Command &amp; Type Definitions with specta-generated bindings, (4) Error Handling &amp; Testing Strategy. Moving to implementation planning.</w:t>
+      </w:r>
+    </w:p>
     <w:sectPr>
       <w:pgSz w:w="12240" w:h="15840"/>
       <w:pgMar w:top="1440" w:right="1800" w:bottom="1440" w:left="1800" w:header="720" w:footer="720" w:gutter="0"/>

</xml_diff>